<commit_message>
Fill in author details and repository link
</commit_message>
<xml_diff>
--- a/paper/EDM_TWR_paper.docx
+++ b/paper/EDM_TWR_paper.docx
@@ -108,7 +108,7 @@
                 <w:i w:val="0"/>
                 <w:sz w:val="18"/>
               </w:rPr>
-              <w:t>[email]</w:t>
+              <w:t>adithyadevaraj1001@gmail.com</w:t>
             </w:r>
           </w:p>
         </w:tc>
@@ -189,7 +189,7 @@
                 <w:i w:val="0"/>
                 <w:sz w:val="18"/>
               </w:rPr>
-              <w:t>[email]</w:t>
+              <w:t>billavasrujan@gmail.com</w:t>
             </w:r>
           </w:p>
         </w:tc>
@@ -270,7 +270,7 @@
                 <w:i w:val="0"/>
                 <w:sz w:val="18"/>
               </w:rPr>
-              <w:t>[email]</w:t>
+              <w:t>ayushsingh10580@gmail.com</w:t>
             </w:r>
           </w:p>
         </w:tc>
@@ -306,7 +306,7 @@
                 <w:i w:val="0"/>
                 <w:sz w:val="18"/>
               </w:rPr>
-              <w:t>[Designation], Dept. of Information Science and Engineering</w:t>
+              <w:t>Assistant Professor, Dept. of Mechanical Engineering</w:t>
             </w:r>
           </w:p>
           <w:p>
@@ -351,7 +351,7 @@
                 <w:i w:val="0"/>
                 <w:sz w:val="18"/>
               </w:rPr>
-              <w:t>[email]</w:t>
+              <w:t>Kshanthala2@gmail.com</w:t>
             </w:r>
           </w:p>
         </w:tc>
@@ -13411,7 +13411,7 @@
           <w:i w:val="0"/>
           <w:sz w:val="20"/>
         </w:rPr>
-        <w:t>The compiled dataset, the per-study raw tables, the extraction and checking scripts, a download script and checksums for the source articles, the analysis code and all result files are available at [repository URL].</w:t>
+        <w:t>The compiled dataset, the per-study raw tables, the extraction and checking scripts, a download script and checksums for the source articles, the analysis code and all result files are available at https://github.com/Ayush-Singh0583/NTM.</w:t>
       </w:r>
     </w:p>
     <w:p>

</xml_diff>

<commit_message>
Use the guide's title in the author list
</commit_message>
<xml_diff>
--- a/paper/EDM_TWR_paper.docx
+++ b/paper/EDM_TWR_paper.docx
@@ -291,7 +291,7 @@
                 <w:i w:val="0"/>
                 <w:sz w:val="20"/>
               </w:rPr>
-              <w:t>Shanthala Kollur</w:t>
+              <w:t>Dr. Shanthala Kollur</w:t>
             </w:r>
           </w:p>
           <w:p>
@@ -13443,7 +13443,7 @@
           <w:i w:val="0"/>
           <w:sz w:val="20"/>
         </w:rPr>
-        <w:t>The authors thank Shanthala Kollur for guidance.</w:t>
+        <w:t>The authors thank Dr. Shanthala Kollur for guidance.</w:t>
       </w:r>
     </w:p>
     <w:p>

</xml_diff>